<commit_message>
Login sahifasida boshlang'ich hisoblar ko'rsatildi
</commit_message>
<xml_diff>
--- a/kurs_ishi/kurs_ishi.docx
+++ b/kurs_ishi/kurs_ishi.docx
@@ -819,7 +819,7 @@
           <w:sz w:val="28"/>
           <w:szCs w:val="28"/>
         </w:rPr>
-        <w:t xml:space="preserve">natijada ishlaydigan veb-ilova yaratildi: u 12 ta marshrutdan iborat, 2 ta foydalanuvchi roli bilan ishlaydi va 10 ta avtomatik test bilan tekshirilgan. Ilova Docker tasviri sifatida ham ishga tushiriladi, shu sababli uni kichik agentlikda ko‘p o‘zgartirishlarsiz joriy etish mumkin. Loyiha bitimlar bo‘yicha komissiyani avtomatik hisoblaydi, sotilgan obyektni qayta sotishga yo‘l qo‘ymaydi va o‘chirish huquqini administratorga cheklaydi.</w:t>
+        <w:t xml:space="preserve">natijada ishlaydigan veb-ilova yaratildi: u 12 ta marshrutdan iborat, 2 ta foydalanuvchi roli bilan ishlaydi va 11 ta avtomatik test bilan tekshirilgan. Ilova Docker tasviri sifatida ham ishga tushiriladi, shu sababli uni kichik agentlikda ko‘p o‘zgartirishlarsiz joriy etish mumkin. Loyiha bitimlar bo‘yicha komissiyani avtomatik hisoblaydi, sotilgan obyektni qayta sotishga yo‘l qo‘ymaydi va o‘chirish huquqini administratorga cheklaydi.</w:t>
       </w:r>
     </w:p>
     <w:p>
@@ -17345,7 +17345,7 @@
           <w:sz w:val="28"/>
           <w:szCs w:val="28"/>
         </w:rPr>
-        <w:t xml:space="preserve">Tizim HTTP chegarasida avtomatik testlar bilan sinaldi: testlar Flask test klienti orqali so‘rovlar yuboradi va javob hamda bazadagi natijani tekshiradi, ilovaning ichki funksiyalariga murojaat qilmaydi. Har bir test uchun alohida bo‘sh baza yaratiladi, shu sababli testlar bir-biriga bog‘liq emas. Jami 10 ta test yozilgan, ularning mazmuni 13-jadvalda keltirilgan, matni esa 3-ilovada berilgan. Testlar Python 3.14.7, Flask 3.1.3 muhitida ishga tushirilganda barchasi muvaffaqiyatli o‘tdi (2,4 soniya).</w:t>
+        <w:t xml:space="preserve">Tizim HTTP chegarasida avtomatik testlar bilan sinaldi: testlar Flask test klienti orqali so‘rovlar yuboradi va javob hamda bazadagi natijani tekshiradi, ilovaning ichki funksiyalariga murojaat qilmaydi. Har bir test uchun alohida bo‘sh baza yaratiladi, shu sababli testlar bir-biriga bog‘liq emas. Jami 11 ta test yozilgan, ularning mazmuni 13-jadvalda keltirilgan, matni esa 3-ilovada berilgan. Testlar Python 3.14.7, Flask 3.1.3 muhitida ishga tushirilganda barchasi muvaffaqiyatli o‘tdi (2,4 soniya).</w:t>
       </w:r>
     </w:p>
     <w:p>
@@ -20768,7 +20768,7 @@
           <w:sz w:val="28"/>
           <w:szCs w:val="28"/>
         </w:rPr>
-        <w:t xml:space="preserve">Ikkinchi ko‘rsatkich — dastur hajmi va soddaligi. Ilova 465 qatorli bitta faylda yozilgan, uning 177 qatori HTML shablonga, qolgani Python kodiga tegishli. Dizayn fayli 112 qator, testlar 129 qator. Tashqi kutubxona faqat Flask. Bu N3 talabini bajaradi va tizimni tushunish hamda qo‘llab-quvvatlashni osonlashtiradi: bitta dasturchi butun kodni bir necha soat ichida o‘qib chiqa oladi.</w:t>
+        <w:t xml:space="preserve">Ikkinchi ko‘rsatkich — dastur hajmi va soddaligi. Ilova 470 qatorli bitta faylda yozilgan, uning 182 qatori HTML shablonga, qolgani Python kodiga tegishli. Dizayn fayli 114 qator, testlar 134 qator. Tashqi kutubxona faqat Flask. Bu N3 talabini bajaradi va tizimni tushunish hamda qo‘llab-quvvatlashni osonlashtiradi: bitta dasturchi butun kodni bir necha soat ichida o‘qib chiqa oladi.</w:t>
       </w:r>
     </w:p>
     <w:p>
@@ -27146,6 +27146,76 @@
           <w:szCs w:val="17"/>
         </w:rPr>
         <w:t xml:space="preserve">            self.assertTrue(response.headers["Location"].endswith("/login"))</w:t>
+      </w:r>
+    </w:p>
+    <w:p>
+      <w:pPr>
+        <w:spacing w:after="0" w:before="0" w:line="240" w:lineRule="auto"/>
+        <w:jc w:val="left"/>
+      </w:pPr>
+      <w:r>
+        <w:rPr>
+          <w:rFonts w:ascii="Courier New" w:cs="Courier New" w:eastAsia="Courier New" w:hAnsi="Courier New"/>
+          <w:sz w:val="17"/>
+          <w:szCs w:val="17"/>
+        </w:rPr>
+        <w:t xml:space="preserve"> </w:t>
+      </w:r>
+    </w:p>
+    <w:p>
+      <w:pPr>
+        <w:spacing w:after="0" w:before="0" w:line="240" w:lineRule="auto"/>
+        <w:jc w:val="left"/>
+      </w:pPr>
+      <w:r>
+        <w:rPr>
+          <w:rFonts w:ascii="Courier New" w:cs="Courier New" w:eastAsia="Courier New" w:hAnsi="Courier New"/>
+          <w:sz w:val="17"/>
+          <w:szCs w:val="17"/>
+        </w:rPr>
+        <w:t xml:space="preserve">    def test_login_page_shows_initial_accounts(self):</w:t>
+      </w:r>
+    </w:p>
+    <w:p>
+      <w:pPr>
+        <w:spacing w:after="0" w:before="0" w:line="240" w:lineRule="auto"/>
+        <w:jc w:val="left"/>
+      </w:pPr>
+      <w:r>
+        <w:rPr>
+          <w:rFonts w:ascii="Courier New" w:cs="Courier New" w:eastAsia="Courier New" w:hAnsi="Courier New"/>
+          <w:sz w:val="17"/>
+          <w:szCs w:val="17"/>
+        </w:rPr>
+        <w:t xml:space="preserve">        page = self.client.get("/login").get_data(as_text=True)</w:t>
+      </w:r>
+    </w:p>
+    <w:p>
+      <w:pPr>
+        <w:spacing w:after="0" w:before="0" w:line="240" w:lineRule="auto"/>
+        <w:jc w:val="left"/>
+      </w:pPr>
+      <w:r>
+        <w:rPr>
+          <w:rFonts w:ascii="Courier New" w:cs="Courier New" w:eastAsia="Courier New" w:hAnsi="Courier New"/>
+          <w:sz w:val="17"/>
+          <w:szCs w:val="17"/>
+        </w:rPr>
+        <w:t xml:space="preserve">        self.assertIn("admin123", page)</w:t>
+      </w:r>
+    </w:p>
+    <w:p>
+      <w:pPr>
+        <w:spacing w:after="0" w:before="0" w:line="240" w:lineRule="auto"/>
+        <w:jc w:val="left"/>
+      </w:pPr>
+      <w:r>
+        <w:rPr>
+          <w:rFonts w:ascii="Courier New" w:cs="Courier New" w:eastAsia="Courier New" w:hAnsi="Courier New"/>
+          <w:sz w:val="17"/>
+          <w:szCs w:val="17"/>
+        </w:rPr>
+        <w:t xml:space="preserve">        self.assertIn("agent123", page)</w:t>
       </w:r>
     </w:p>
     <w:p>

</xml_diff>